<commit_message>
Docs: the images job passed on GitHub (docs/53 section 6, docs/55)
Co-Authored-By: Claude Opus 5.5 <noreply@anthropic.com>
Claude-Session: https://claude.ai/code/session_012HHcRrzuvMBTL2FYxXtsyv
</commit_message>
<xml_diff>
--- a/treasury-platform/docs/53-PILOT-RUN.docx
+++ b/treasury-platform/docs/53-PILOT-RUN.docx
@@ -874,6 +874,27 @@
       </w:hyperlink>
     </w:p>
     <w:p>
+      <w:pPr>
+        <w:bidi/>
+        <w:spacing w:after="50" w:before="0"/>
+        <w:ind w:left="0"/>
+      </w:pPr>
+      <w:hyperlink w:history="1" w:anchor="_sec6">
+        <w:r>
+          <w:rPr>
+            <w:rFonts w:ascii="Arial" w:cs="Arial" w:eastAsia="Arial" w:hAnsi="Arial"/>
+            <w:b/>
+            <w:bCs/>
+            <w:color w:val="1F3A5F"/>
+            <w:sz w:val="20"/>
+            <w:szCs w:val="20"/>
+            <w:rtl/>
+          </w:rPr>
+          <w:t xml:space="preserve">6. التحقق في GitHub (أُضيف في 2026-10-25)</w:t>
+        </w:r>
+      </w:hyperlink>
+    </w:p>
+    <w:p>
       <w:r>
         <w:br w:type="page"/>
       </w:r>
@@ -2240,6 +2261,179 @@
           <w:rtl/>
         </w:rPr>
         <w:t xml:space="preserve"> مع مستخدم من الخزينة.</w:t>
+      </w:r>
+    </w:p>
+    <w:p>
+      <w:pPr>
+        <w:bidi/>
+        <w:spacing w:after="60" w:before="0"/>
+      </w:pPr>
+    </w:p>
+    <w:p>
+      <w:pPr>
+        <w:pStyle w:val="Heading1"/>
+        <w:bidi/>
+      </w:pPr>
+      <w:bookmarkStart w:name="_sec6" w:id="6"/>
+      <w:r>
+        <w:rPr>
+          <w:rFonts w:ascii="Arial" w:cs="Arial" w:eastAsia="Arial" w:hAnsi="Arial"/>
+          <w:b/>
+          <w:bCs/>
+          <w:color w:val="1F3A5F"/>
+          <w:sz w:val="32"/>
+          <w:szCs w:val="32"/>
+          <w:rtl/>
+        </w:rPr>
+        <w:t xml:space="preserve">6. التحقق في GitHub (أُضيف في 2026-10-25)</w:t>
+      </w:r>
+      <w:bookmarkEnd w:id="6"/>
+    </w:p>
+    <w:p>
+      <w:pPr>
+        <w:pStyle w:val="ListParagraph"/>
+        <w:numPr>
+          <w:ilvl w:val="0"/>
+          <w:numId w:val="2"/>
+        </w:numPr>
+        <w:bidi/>
+        <w:spacing w:after="70" w:before="0" w:line="300"/>
+      </w:pPr>
+      <w:r>
+        <w:rPr>
+          <w:rFonts w:ascii="Arial" w:cs="Arial" w:eastAsia="Arial" w:hAnsi="Arial"/>
+          <w:b/>
+          <w:bCs/>
+          <w:sz w:val="21"/>
+          <w:szCs w:val="21"/>
+          <w:rtl/>
+        </w:rPr>
+        <w:t xml:space="preserve">المهمة الجديدة:</w:t>
+      </w:r>
+      <w:r>
+        <w:rPr>
+          <w:rFonts w:ascii="Arial" w:cs="Arial" w:eastAsia="Arial" w:hAnsi="Arial"/>
+          <w:b w:val="false"/>
+          <w:bCs w:val="false"/>
+          <w:sz w:val="21"/>
+          <w:szCs w:val="21"/>
+          <w:rtl/>
+        </w:rPr>
+        <w:t xml:space="preserve"> </w:t>
+      </w:r>
+      <w:r>
+        <w:rPr>
+          <w:rFonts w:ascii="Courier New" w:cs="Courier New" w:eastAsia="Courier New" w:hAnsi="Courier New"/>
+          <w:b w:val="false"/>
+          <w:bCs w:val="false"/>
+          <w:color w:val="1F2937"/>
+          <w:sz w:val="18"/>
+          <w:szCs w:val="18"/>
+          <w:shd w:fill="F1F3F5" w:color="auto" w:val="clear"/>
+          <w:rtl/>
+        </w:rPr>
+        <w:t xml:space="preserve">‎images‎</w:t>
+      </w:r>
+      <w:r>
+        <w:rPr>
+          <w:rFonts w:ascii="Arial" w:cs="Arial" w:eastAsia="Arial" w:hAnsi="Arial"/>
+          <w:b w:val="false"/>
+          <w:bCs w:val="false"/>
+          <w:sz w:val="21"/>
+          <w:szCs w:val="21"/>
+          <w:rtl/>
+        </w:rPr>
+        <w:t xml:space="preserve"> في </w:t>
+      </w:r>
+      <w:r>
+        <w:rPr>
+          <w:rFonts w:ascii="Courier New" w:cs="Courier New" w:eastAsia="Courier New" w:hAnsi="Courier New"/>
+          <w:b w:val="false"/>
+          <w:bCs w:val="false"/>
+          <w:color w:val="1F2937"/>
+          <w:sz w:val="18"/>
+          <w:szCs w:val="18"/>
+          <w:shd w:fill="F1F3F5" w:color="auto" w:val="clear"/>
+          <w:rtl/>
+        </w:rPr>
+        <w:t xml:space="preserve">‎treasury-db-ci‎</w:t>
+      </w:r>
+      <w:r>
+        <w:rPr>
+          <w:rFonts w:ascii="Arial" w:cs="Arial" w:eastAsia="Arial" w:hAnsi="Arial"/>
+          <w:b w:val="false"/>
+          <w:bCs w:val="false"/>
+          <w:sz w:val="21"/>
+          <w:szCs w:val="21"/>
+          <w:rtl/>
+        </w:rPr>
+        <w:t xml:space="preserve">. تكرر هذا التشغيل التجريبي مع كل تعديل على خادم GitHub، بشبكة حقيقية وبلا وكيل.</w:t>
+      </w:r>
+    </w:p>
+    <w:p>
+      <w:pPr>
+        <w:pStyle w:val="ListParagraph"/>
+        <w:numPr>
+          <w:ilvl w:val="0"/>
+          <w:numId w:val="2"/>
+        </w:numPr>
+        <w:bidi/>
+        <w:spacing w:after="70" w:before="0" w:line="300"/>
+      </w:pPr>
+      <w:r>
+        <w:rPr>
+          <w:rFonts w:ascii="Arial" w:cs="Arial" w:eastAsia="Arial" w:hAnsi="Arial"/>
+          <w:b/>
+          <w:bCs/>
+          <w:sz w:val="21"/>
+          <w:szCs w:val="21"/>
+          <w:rtl/>
+        </w:rPr>
+        <w:t xml:space="preserve">أول تشغيل:</w:t>
+      </w:r>
+      <w:r>
+        <w:rPr>
+          <w:rFonts w:ascii="Arial" w:cs="Arial" w:eastAsia="Arial" w:hAnsi="Arial"/>
+          <w:b w:val="false"/>
+          <w:bCs w:val="false"/>
+          <w:sz w:val="21"/>
+          <w:szCs w:val="21"/>
+          <w:rtl/>
+        </w:rPr>
+        <w:t xml:space="preserve"> كشف أن صورة الخادم لا تُبنى حين لا تُمرَّر شهادة الوكيل، وهي حال الخادم الحقيقي، فأُصلح الخلل.</w:t>
+      </w:r>
+    </w:p>
+    <w:p>
+      <w:pPr>
+        <w:pStyle w:val="ListParagraph"/>
+        <w:numPr>
+          <w:ilvl w:val="0"/>
+          <w:numId w:val="2"/>
+        </w:numPr>
+        <w:bidi/>
+        <w:spacing w:after="70" w:before="0" w:line="300"/>
+      </w:pPr>
+      <w:r>
+        <w:rPr>
+          <w:rFonts w:ascii="Arial" w:cs="Arial" w:eastAsia="Arial" w:hAnsi="Arial"/>
+          <w:b/>
+          <w:bCs/>
+          <w:sz w:val="21"/>
+          <w:szCs w:val="21"/>
+          <w:rtl/>
+        </w:rPr>
+        <w:t xml:space="preserve">التشغيل التالي:</w:t>
+      </w:r>
+      <w:r>
+        <w:rPr>
+          <w:rFonts w:ascii="Arial" w:cs="Arial" w:eastAsia="Arial" w:hAnsi="Arial"/>
+          <w:b w:val="false"/>
+          <w:bCs w:val="false"/>
+          <w:sz w:val="21"/>
+          <w:szCs w:val="21"/>
+          <w:rtl/>
+        </w:rPr>
+        <w:t xml:space="preserve"> نجح كله: البناء مع تنزيل Chromium من Playwright، ونشر القاعدة كما في الإنتاج، واختبار المتصفح على الحاويتين.</w:t>
       </w:r>
     </w:p>
     <w:p>

</xml_diff>